<commit_message>
Deploy preview for PR 3 🛫
</commit_message>
<xml_diff>
--- a/pr-preview/pr-3/chapters/chapter1-tracked-changes.docx
+++ b/pr-preview/pr-3/chapters/chapter1-tracked-changes.docx
@@ -469,53 +469,69 @@
       <w:pPr>
         <w:pStyle w:val="BodyText"/>
       </w:pPr>
-      <w:r>
-        <w:t xml:space="preserve">I’m adding some new content here:</w:t>
-      </w:r>
+      <w:ins w:id="1018" w:author="PR Preview" w:date="2024-01-01T00:00:00Z">
+        <w:r>
+          <w:t xml:space="preserve">I’m adding some new content here:</w:t>
+        </w:r>
+      </w:ins>
     </w:p>
     <w:p>
       <w:pPr>
         <w:pStyle w:val="SourceCode"/>
       </w:pPr>
-      <w:r>
-        <w:rPr>
-          <w:rStyle w:val="DecValTok"/>
-        </w:rPr>
-        <w:t xml:space="preserve">1</w:t>
-      </w:r>
-      <w:r>
-        <w:rPr>
-          <w:rStyle w:val="NormalTok"/>
-        </w:rPr>
-        <w:t xml:space="preserve"> </w:t>
-      </w:r>
-      <w:r>
-        <w:rPr>
-          <w:rStyle w:val="SpecialCharTok"/>
-        </w:rPr>
-        <w:t xml:space="preserve">+</w:t>
-      </w:r>
-      <w:r>
-        <w:rPr>
-          <w:rStyle w:val="NormalTok"/>
-        </w:rPr>
-        <w:t xml:space="preserve"> </w:t>
-      </w:r>
-      <w:r>
-        <w:rPr>
-          <w:rStyle w:val="DecValTok"/>
-        </w:rPr>
-        <w:t xml:space="preserve">1</w:t>
-      </w:r>
-      <w:r>
-        <w:br/>
-      </w:r>
-      <w:r>
-        <w:rPr>
-          <w:rStyle w:val="CommentTok"/>
-        </w:rPr>
-        <w:t xml:space="preserve">#&gt; [1] 2</w:t>
-      </w:r>
+      <w:ins w:id="1019" w:author="PR Preview" w:date="2024-01-01T00:00:00Z">
+        <w:r>
+          <w:rPr>
+            <w:rStyle w:val="DecValTok"/>
+          </w:rPr>
+          <w:t xml:space="preserve">1</w:t>
+        </w:r>
+      </w:ins>
+      <w:ins w:id="1019" w:author="PR Preview" w:date="2024-01-01T00:00:00Z">
+        <w:r>
+          <w:rPr>
+            <w:rStyle w:val="NormalTok"/>
+          </w:rPr>
+          <w:t xml:space="preserve"> </w:t>
+        </w:r>
+      </w:ins>
+      <w:ins w:id="1019" w:author="PR Preview" w:date="2024-01-01T00:00:00Z">
+        <w:r>
+          <w:rPr>
+            <w:rStyle w:val="SpecialCharTok"/>
+          </w:rPr>
+          <w:t xml:space="preserve">+</w:t>
+        </w:r>
+      </w:ins>
+      <w:ins w:id="1019" w:author="PR Preview" w:date="2024-01-01T00:00:00Z">
+        <w:r>
+          <w:rPr>
+            <w:rStyle w:val="NormalTok"/>
+          </w:rPr>
+          <w:t xml:space="preserve"> </w:t>
+        </w:r>
+      </w:ins>
+      <w:ins w:id="1019" w:author="PR Preview" w:date="2024-01-01T00:00:00Z">
+        <w:r>
+          <w:rPr>
+            <w:rStyle w:val="DecValTok"/>
+          </w:rPr>
+          <w:t xml:space="preserve">1</w:t>
+        </w:r>
+      </w:ins>
+      <w:ins w:id="1019" w:author="PR Preview" w:date="2024-01-01T00:00:00Z">
+        <w:r>
+          <w:br/>
+        </w:r>
+      </w:ins>
+      <w:ins w:id="1019" w:author="PR Preview" w:date="2024-01-01T00:00:00Z">
+        <w:r>
+          <w:rPr>
+            <w:rStyle w:val="CommentTok"/>
+          </w:rPr>
+          <w:t xml:space="preserve">#&gt; [1] 2</w:t>
+        </w:r>
+      </w:ins>
     </w:p>
     <w:bookmarkEnd w:id="13"/>
     <w:bookmarkStart w:id="15" w:name="references"/>
@@ -556,19 +572,25 @@
           <w:numId w:val="1002"/>
         </w:numPr>
       </w:pPr>
-      <w:r>
-        <w:rPr>
-          <w:b/>
-          <w:bCs/>
-        </w:rPr>
-        <w:t xml:space="preserve">Branch:</w:t>
-      </w:r>
-      <w:r>
-        <w:t xml:space="preserve"> </w:t>
-      </w:r>
-      <w:r>
-        <w:t xml:space="preserve">HEAD</w:t>
-      </w:r>
+      <w:ins w:id="23" w:author="PR Preview" w:date="2024-01-01T00:00:00Z">
+        <w:r>
+          <w:rPr>
+            <w:b/>
+            <w:bCs/>
+          </w:rPr>
+          <w:t xml:space="preserve">Branch:</w:t>
+        </w:r>
+      </w:ins>
+      <w:ins w:id="23" w:author="PR Preview" w:date="2024-01-01T00:00:00Z">
+        <w:r>
+          <w:t xml:space="preserve"> </w:t>
+        </w:r>
+      </w:ins>
+      <w:ins w:id="23" w:author="PR Preview" w:date="2024-01-01T00:00:00Z">
+        <w:r>
+          <w:t xml:space="preserve">HEAD</w:t>
+        </w:r>
+      </w:ins>
     </w:p>
     <w:p>
       <w:pPr>
@@ -578,19 +600,25 @@
           <w:numId w:val="1002"/>
         </w:numPr>
       </w:pPr>
-      <w:r>
-        <w:rPr>
-          <w:b/>
-          <w:bCs/>
-        </w:rPr>
-        <w:t xml:space="preserve">Commit:</w:t>
-      </w:r>
-      <w:r>
-        <w:t xml:space="preserve"> </w:t>
-      </w:r>
-      <w:r>
-        <w:t xml:space="preserve">eb46d6f</w:t>
-      </w:r>
+      <w:ins w:id="24" w:author="PR Preview" w:date="2024-01-01T00:00:00Z">
+        <w:r>
+          <w:rPr>
+            <w:b/>
+            <w:bCs/>
+          </w:rPr>
+          <w:t xml:space="preserve">Commit:</w:t>
+        </w:r>
+      </w:ins>
+      <w:ins w:id="24" w:author="PR Preview" w:date="2024-01-01T00:00:00Z">
+        <w:r>
+          <w:t xml:space="preserve"> </w:t>
+        </w:r>
+      </w:ins>
+      <w:ins w:id="24" w:author="PR Preview" w:date="2024-01-01T00:00:00Z">
+        <w:r>
+          <w:t xml:space="preserve">93e77bf</w:t>
+        </w:r>
+      </w:ins>
     </w:p>
     <w:p>
       <w:pPr>
@@ -600,19 +628,25 @@
           <w:numId w:val="1002"/>
         </w:numPr>
       </w:pPr>
-      <w:r>
-        <w:rPr>
-          <w:b/>
-          <w:bCs/>
-        </w:rPr>
-        <w:t xml:space="preserve">Full commit hash:</w:t>
-      </w:r>
-      <w:r>
-        <w:t xml:space="preserve"> </w:t>
-      </w:r>
-      <w:r>
-        <w:t xml:space="preserve">eb46d6f54dd87c3dee6b8c98024c24f1e0cd0b47</w:t>
-      </w:r>
+      <w:ins w:id="25" w:author="PR Preview" w:date="2024-01-01T00:00:00Z">
+        <w:r>
+          <w:rPr>
+            <w:b/>
+            <w:bCs/>
+          </w:rPr>
+          <w:t xml:space="preserve">Full commit hash:</w:t>
+        </w:r>
+      </w:ins>
+      <w:ins w:id="25" w:author="PR Preview" w:date="2024-01-01T00:00:00Z">
+        <w:r>
+          <w:t xml:space="preserve"> </w:t>
+        </w:r>
+      </w:ins>
+      <w:ins w:id="25" w:author="PR Preview" w:date="2024-01-01T00:00:00Z">
+        <w:r>
+          <w:t xml:space="preserve">93e77bf1e28e13f78c43db2af09cca9b960df9ad</w:t>
+        </w:r>
+      </w:ins>
     </w:p>
     <w:p>
       <w:pPr>
@@ -622,19 +656,25 @@
           <w:numId w:val="1002"/>
         </w:numPr>
       </w:pPr>
-      <w:r>
-        <w:rPr>
-          <w:b/>
-          <w:bCs/>
-        </w:rPr>
-        <w:t xml:space="preserve">Commit date:</w:t>
-      </w:r>
-      <w:r>
-        <w:t xml:space="preserve"> </w:t>
-      </w:r>
-      <w:r>
-        <w:t xml:space="preserve">2026-04-07 00:30:29 +0000</w:t>
-      </w:r>
+      <w:ins w:id="26" w:author="PR Preview" w:date="2024-01-01T00:00:00Z">
+        <w:r>
+          <w:rPr>
+            <w:b/>
+            <w:bCs/>
+          </w:rPr>
+          <w:t xml:space="preserve">Commit date:</w:t>
+        </w:r>
+      </w:ins>
+      <w:ins w:id="26" w:author="PR Preview" w:date="2024-01-01T00:00:00Z">
+        <w:r>
+          <w:t xml:space="preserve"> </w:t>
+        </w:r>
+      </w:ins>
+      <w:ins w:id="26" w:author="PR Preview" w:date="2024-01-01T00:00:00Z">
+        <w:r>
+          <w:t xml:space="preserve">2026-04-06 17:52:47 -0700</w:t>
+        </w:r>
+      </w:ins>
     </w:p>
     <w:p>
       <w:pPr>

</xml_diff>